<commit_message>
UD7.BASES DE DATOS_MAS ACTUALIZACION DE MATERIAL DIDACTICO
</commit_message>
<xml_diff>
--- a/HeroDaw-Practica Examen Marzo 2026/documents/EXAMEN DE PROGRAMACIÓN.docx
+++ b/HeroDaw-Practica Examen Marzo 2026/documents/EXAMEN DE PROGRAMACIÓN.docx
@@ -66,7 +66,99 @@
         <w:rPr>
           <w:highlight w:val="yellow"/>
         </w:rPr>
-        <w:t>: Debe ser el "molde" base. Atributos: DNI (8 dígitos y letra) , nombre , fechaNacimiento (LocalDate) , direccion y numContrato (String).</w:t>
+        <w:t>: Debe ser el "molde" base. Atributos: DNI (8 dígitos y letra</w:t>
+      </w:r>
+      <w:proofErr w:type="gramStart"/>
+      <w:r>
+        <w:rPr>
+          <w:highlight w:val="yellow"/>
+        </w:rPr>
+        <w:t>) ,</w:t>
+      </w:r>
+      <w:proofErr w:type="gramEnd"/>
+      <w:r>
+        <w:rPr>
+          <w:highlight w:val="yellow"/>
+        </w:rPr>
+        <w:t xml:space="preserve"> </w:t>
+      </w:r>
+      <w:proofErr w:type="gramStart"/>
+      <w:r>
+        <w:rPr>
+          <w:highlight w:val="yellow"/>
+        </w:rPr>
+        <w:t>nombre ,</w:t>
+      </w:r>
+      <w:proofErr w:type="gramEnd"/>
+      <w:r>
+        <w:rPr>
+          <w:highlight w:val="yellow"/>
+        </w:rPr>
+        <w:t xml:space="preserve"> </w:t>
+      </w:r>
+      <w:proofErr w:type="spellStart"/>
+      <w:r>
+        <w:rPr>
+          <w:highlight w:val="yellow"/>
+        </w:rPr>
+        <w:t>fechaNacimiento</w:t>
+      </w:r>
+      <w:proofErr w:type="spellEnd"/>
+      <w:r>
+        <w:rPr>
+          <w:highlight w:val="yellow"/>
+        </w:rPr>
+        <w:t xml:space="preserve"> (</w:t>
+      </w:r>
+      <w:proofErr w:type="spellStart"/>
+      <w:r>
+        <w:rPr>
+          <w:highlight w:val="yellow"/>
+        </w:rPr>
+        <w:t>LocalDate</w:t>
+      </w:r>
+      <w:proofErr w:type="spellEnd"/>
+      <w:proofErr w:type="gramStart"/>
+      <w:r>
+        <w:rPr>
+          <w:highlight w:val="yellow"/>
+        </w:rPr>
+        <w:t>) ,</w:t>
+      </w:r>
+      <w:proofErr w:type="gramEnd"/>
+      <w:r>
+        <w:rPr>
+          <w:highlight w:val="yellow"/>
+        </w:rPr>
+        <w:t xml:space="preserve"> </w:t>
+      </w:r>
+      <w:proofErr w:type="spellStart"/>
+      <w:r>
+        <w:rPr>
+          <w:highlight w:val="yellow"/>
+        </w:rPr>
+        <w:t>direccion</w:t>
+      </w:r>
+      <w:proofErr w:type="spellEnd"/>
+      <w:r>
+        <w:rPr>
+          <w:highlight w:val="yellow"/>
+        </w:rPr>
+        <w:t xml:space="preserve"> y </w:t>
+      </w:r>
+      <w:proofErr w:type="spellStart"/>
+      <w:r>
+        <w:rPr>
+          <w:highlight w:val="yellow"/>
+        </w:rPr>
+        <w:t>numContrato</w:t>
+      </w:r>
+      <w:proofErr w:type="spellEnd"/>
+      <w:r>
+        <w:rPr>
+          <w:highlight w:val="yellow"/>
+        </w:rPr>
+        <w:t xml:space="preserve"> (String).</w:t>
       </w:r>
     </w:p>
     <w:p>
@@ -85,13 +177,195 @@
           <w:bCs/>
           <w:highlight w:val="yellow"/>
         </w:rPr>
-        <w:t>Clase Heroe (Hereda de Persona)</w:t>
-      </w:r>
-      <w:r>
-        <w:rPr>
-          <w:highlight w:val="yellow"/>
-        </w:rPr>
-        <w:t>: Atributos: idHeroe (int autoincremental) , rango (Enum) , poder (Enum) , ataque (double 0-100) , defensa (double 0-100) e isActivo (boolean).</w:t>
+        <w:t xml:space="preserve">Clase </w:t>
+      </w:r>
+      <w:proofErr w:type="spellStart"/>
+      <w:r>
+        <w:rPr>
+          <w:b/>
+          <w:bCs/>
+          <w:highlight w:val="yellow"/>
+        </w:rPr>
+        <w:t>Heroe</w:t>
+      </w:r>
+      <w:proofErr w:type="spellEnd"/>
+      <w:r>
+        <w:rPr>
+          <w:b/>
+          <w:bCs/>
+          <w:highlight w:val="yellow"/>
+        </w:rPr>
+        <w:t xml:space="preserve"> (Hereda de Persona)</w:t>
+      </w:r>
+      <w:r>
+        <w:rPr>
+          <w:highlight w:val="yellow"/>
+        </w:rPr>
+        <w:t xml:space="preserve">: Atributos: </w:t>
+      </w:r>
+      <w:proofErr w:type="spellStart"/>
+      <w:r>
+        <w:rPr>
+          <w:highlight w:val="yellow"/>
+        </w:rPr>
+        <w:t>idHeroe</w:t>
+      </w:r>
+      <w:proofErr w:type="spellEnd"/>
+      <w:r>
+        <w:rPr>
+          <w:highlight w:val="yellow"/>
+        </w:rPr>
+        <w:t xml:space="preserve"> (</w:t>
+      </w:r>
+      <w:proofErr w:type="spellStart"/>
+      <w:r>
+        <w:rPr>
+          <w:highlight w:val="yellow"/>
+        </w:rPr>
+        <w:t>int</w:t>
+      </w:r>
+      <w:proofErr w:type="spellEnd"/>
+      <w:r>
+        <w:rPr>
+          <w:highlight w:val="yellow"/>
+        </w:rPr>
+        <w:t xml:space="preserve"> </w:t>
+      </w:r>
+      <w:proofErr w:type="spellStart"/>
+      <w:r>
+        <w:rPr>
+          <w:highlight w:val="yellow"/>
+        </w:rPr>
+        <w:t>autoincremental</w:t>
+      </w:r>
+      <w:proofErr w:type="spellEnd"/>
+      <w:proofErr w:type="gramStart"/>
+      <w:r>
+        <w:rPr>
+          <w:highlight w:val="yellow"/>
+        </w:rPr>
+        <w:t>) ,</w:t>
+      </w:r>
+      <w:proofErr w:type="gramEnd"/>
+      <w:r>
+        <w:rPr>
+          <w:highlight w:val="yellow"/>
+        </w:rPr>
+        <w:t xml:space="preserve"> rango (</w:t>
+      </w:r>
+      <w:proofErr w:type="spellStart"/>
+      <w:r>
+        <w:rPr>
+          <w:highlight w:val="yellow"/>
+        </w:rPr>
+        <w:t>Enum</w:t>
+      </w:r>
+      <w:proofErr w:type="spellEnd"/>
+      <w:proofErr w:type="gramStart"/>
+      <w:r>
+        <w:rPr>
+          <w:highlight w:val="yellow"/>
+        </w:rPr>
+        <w:t>) ,</w:t>
+      </w:r>
+      <w:proofErr w:type="gramEnd"/>
+      <w:r>
+        <w:rPr>
+          <w:highlight w:val="yellow"/>
+        </w:rPr>
+        <w:t xml:space="preserve"> poder (</w:t>
+      </w:r>
+      <w:proofErr w:type="spellStart"/>
+      <w:r>
+        <w:rPr>
+          <w:highlight w:val="yellow"/>
+        </w:rPr>
+        <w:t>Enum</w:t>
+      </w:r>
+      <w:proofErr w:type="spellEnd"/>
+      <w:proofErr w:type="gramStart"/>
+      <w:r>
+        <w:rPr>
+          <w:highlight w:val="yellow"/>
+        </w:rPr>
+        <w:t>) ,</w:t>
+      </w:r>
+      <w:proofErr w:type="gramEnd"/>
+      <w:r>
+        <w:rPr>
+          <w:highlight w:val="yellow"/>
+        </w:rPr>
+        <w:t xml:space="preserve"> ataque (</w:t>
+      </w:r>
+      <w:proofErr w:type="spellStart"/>
+      <w:r>
+        <w:rPr>
+          <w:highlight w:val="yellow"/>
+        </w:rPr>
+        <w:t>double</w:t>
+      </w:r>
+      <w:proofErr w:type="spellEnd"/>
+      <w:r>
+        <w:rPr>
+          <w:highlight w:val="yellow"/>
+        </w:rPr>
+        <w:t xml:space="preserve"> 0-100</w:t>
+      </w:r>
+      <w:proofErr w:type="gramStart"/>
+      <w:r>
+        <w:rPr>
+          <w:highlight w:val="yellow"/>
+        </w:rPr>
+        <w:t>) ,</w:t>
+      </w:r>
+      <w:proofErr w:type="gramEnd"/>
+      <w:r>
+        <w:rPr>
+          <w:highlight w:val="yellow"/>
+        </w:rPr>
+        <w:t xml:space="preserve"> defensa (</w:t>
+      </w:r>
+      <w:proofErr w:type="spellStart"/>
+      <w:r>
+        <w:rPr>
+          <w:highlight w:val="yellow"/>
+        </w:rPr>
+        <w:t>double</w:t>
+      </w:r>
+      <w:proofErr w:type="spellEnd"/>
+      <w:r>
+        <w:rPr>
+          <w:highlight w:val="yellow"/>
+        </w:rPr>
+        <w:t xml:space="preserve"> 0-100) e </w:t>
+      </w:r>
+      <w:proofErr w:type="spellStart"/>
+      <w:r>
+        <w:rPr>
+          <w:highlight w:val="yellow"/>
+        </w:rPr>
+        <w:t>isActivo</w:t>
+      </w:r>
+      <w:proofErr w:type="spellEnd"/>
+      <w:r>
+        <w:rPr>
+          <w:highlight w:val="yellow"/>
+        </w:rPr>
+        <w:t xml:space="preserve"> (</w:t>
+      </w:r>
+      <w:proofErr w:type="spellStart"/>
+      <w:r>
+        <w:rPr>
+          <w:highlight w:val="yellow"/>
+        </w:rPr>
+        <w:t>boolean</w:t>
+      </w:r>
+      <w:proofErr w:type="spellEnd"/>
+      <w:r>
+        <w:rPr>
+          <w:highlight w:val="yellow"/>
+        </w:rPr>
+        <w:t>).</w:t>
       </w:r>
     </w:p>
     <w:p>
@@ -110,13 +384,87 @@
           <w:bCs/>
           <w:highlight w:val="yellow"/>
         </w:rPr>
-        <w:t>Clase Capitan (Hereda de Heroe)</w:t>
-      </w:r>
-      <w:r>
-        <w:rPr>
-          <w:highlight w:val="yellow"/>
-        </w:rPr>
-        <w:t>: Atributos: codCapitan (String aleatorio) , estrategia (double 0-100) y liderazgo (double 0-100).</w:t>
+        <w:t xml:space="preserve">Clase Capitan (Hereda de </w:t>
+      </w:r>
+      <w:proofErr w:type="spellStart"/>
+      <w:r>
+        <w:rPr>
+          <w:b/>
+          <w:bCs/>
+          <w:highlight w:val="yellow"/>
+        </w:rPr>
+        <w:t>Heroe</w:t>
+      </w:r>
+      <w:proofErr w:type="spellEnd"/>
+      <w:r>
+        <w:rPr>
+          <w:b/>
+          <w:bCs/>
+          <w:highlight w:val="yellow"/>
+        </w:rPr>
+        <w:t>)</w:t>
+      </w:r>
+      <w:r>
+        <w:rPr>
+          <w:highlight w:val="yellow"/>
+        </w:rPr>
+        <w:t xml:space="preserve">: Atributos: </w:t>
+      </w:r>
+      <w:proofErr w:type="spellStart"/>
+      <w:r>
+        <w:rPr>
+          <w:highlight w:val="yellow"/>
+        </w:rPr>
+        <w:t>codCapitan</w:t>
+      </w:r>
+      <w:proofErr w:type="spellEnd"/>
+      <w:r>
+        <w:rPr>
+          <w:highlight w:val="yellow"/>
+        </w:rPr>
+        <w:t xml:space="preserve"> (String aleatorio</w:t>
+      </w:r>
+      <w:proofErr w:type="gramStart"/>
+      <w:r>
+        <w:rPr>
+          <w:highlight w:val="yellow"/>
+        </w:rPr>
+        <w:t>) ,</w:t>
+      </w:r>
+      <w:proofErr w:type="gramEnd"/>
+      <w:r>
+        <w:rPr>
+          <w:highlight w:val="yellow"/>
+        </w:rPr>
+        <w:t xml:space="preserve"> estrategia (</w:t>
+      </w:r>
+      <w:proofErr w:type="spellStart"/>
+      <w:r>
+        <w:rPr>
+          <w:highlight w:val="yellow"/>
+        </w:rPr>
+        <w:t>double</w:t>
+      </w:r>
+      <w:proofErr w:type="spellEnd"/>
+      <w:r>
+        <w:rPr>
+          <w:highlight w:val="yellow"/>
+        </w:rPr>
+        <w:t xml:space="preserve"> 0-100) y liderazgo (</w:t>
+      </w:r>
+      <w:proofErr w:type="spellStart"/>
+      <w:r>
+        <w:rPr>
+          <w:highlight w:val="yellow"/>
+        </w:rPr>
+        <w:t>double</w:t>
+      </w:r>
+      <w:proofErr w:type="spellEnd"/>
+      <w:r>
+        <w:rPr>
+          <w:highlight w:val="yellow"/>
+        </w:rPr>
+        <w:t xml:space="preserve"> 0-100).</w:t>
       </w:r>
     </w:p>
     <w:p>
@@ -156,7 +504,49 @@
         <w:rPr>
           <w:highlight w:val="yellow"/>
         </w:rPr>
-        <w:t xml:space="preserve">: nombre, CIF (validado: 1 letra y 8 números) , fechaFundacion y un ArrayList de </w:t>
+        <w:t>: nombre, CIF (validado: 1 letra y 8 números</w:t>
+      </w:r>
+      <w:proofErr w:type="gramStart"/>
+      <w:r>
+        <w:rPr>
+          <w:highlight w:val="yellow"/>
+        </w:rPr>
+        <w:t>) ,</w:t>
+      </w:r>
+      <w:proofErr w:type="gramEnd"/>
+      <w:r>
+        <w:rPr>
+          <w:highlight w:val="yellow"/>
+        </w:rPr>
+        <w:t xml:space="preserve"> </w:t>
+      </w:r>
+      <w:proofErr w:type="spellStart"/>
+      <w:r>
+        <w:rPr>
+          <w:highlight w:val="yellow"/>
+        </w:rPr>
+        <w:t>fechaFundacion</w:t>
+      </w:r>
+      <w:proofErr w:type="spellEnd"/>
+      <w:r>
+        <w:rPr>
+          <w:highlight w:val="yellow"/>
+        </w:rPr>
+        <w:t xml:space="preserve"> y un </w:t>
+      </w:r>
+      <w:proofErr w:type="spellStart"/>
+      <w:r>
+        <w:rPr>
+          <w:highlight w:val="yellow"/>
+        </w:rPr>
+        <w:t>ArrayList</w:t>
+      </w:r>
+      <w:proofErr w:type="spellEnd"/>
+      <w:r>
+        <w:rPr>
+          <w:highlight w:val="yellow"/>
+        </w:rPr>
+        <w:t xml:space="preserve"> de </w:t>
       </w:r>
       <w:r>
         <w:rPr>
@@ -222,7 +612,21 @@
         <w:rPr>
           <w:highlight w:val="yellow"/>
         </w:rPr>
-        <w:t>Al iniciar: Cargar el resto del objeto Academia desde academia.dat (Binario/Serializable).</w:t>
+        <w:t>Al iniciar: Cargar el resto del objeto Academia desde academia.dat (Binario/</w:t>
+      </w:r>
+      <w:proofErr w:type="spellStart"/>
+      <w:r>
+        <w:rPr>
+          <w:highlight w:val="yellow"/>
+        </w:rPr>
+        <w:t>Serializable</w:t>
+      </w:r>
+      <w:proofErr w:type="spellEnd"/>
+      <w:r>
+        <w:rPr>
+          <w:highlight w:val="yellow"/>
+        </w:rPr>
+        <w:t>).</w:t>
       </w:r>
     </w:p>
     <w:p>
@@ -266,9 +670,23 @@
           <w:ilvl w:val="1"/>
           <w:numId w:val="16"/>
         </w:numPr>
-      </w:pPr>
-      <w:r>
-        <w:t>registrarEquipo: El capitán no puede estar en otro equipo.</w:t>
+        <w:rPr>
+          <w:highlight w:val="yellow"/>
+        </w:rPr>
+      </w:pPr>
+      <w:proofErr w:type="spellStart"/>
+      <w:r>
+        <w:rPr>
+          <w:highlight w:val="yellow"/>
+        </w:rPr>
+        <w:t>registrarEquipo</w:t>
+      </w:r>
+      <w:proofErr w:type="spellEnd"/>
+      <w:r>
+        <w:rPr>
+          <w:highlight w:val="yellow"/>
+        </w:rPr>
+        <w:t>: El capitán no puede estar en otro equipo.</w:t>
       </w:r>
     </w:p>
     <w:p>
@@ -278,8 +696,29 @@
           <w:numId w:val="16"/>
         </w:numPr>
       </w:pPr>
-      <w:r>
-        <w:t>asignarHeroeAEquipo: Comprobar que no exceda el máximo y generar numContrato con formato HERO-CodEquipo.</w:t>
+      <w:proofErr w:type="spellStart"/>
+      <w:r>
+        <w:t>asignarHeroeAEquipo</w:t>
+      </w:r>
+      <w:proofErr w:type="spellEnd"/>
+      <w:r>
+        <w:t xml:space="preserve">: Comprobar que no exceda el máximo y generar </w:t>
+      </w:r>
+      <w:proofErr w:type="spellStart"/>
+      <w:r>
+        <w:t>numContrato</w:t>
+      </w:r>
+      <w:proofErr w:type="spellEnd"/>
+      <w:r>
+        <w:t xml:space="preserve"> con formato HERO-</w:t>
+      </w:r>
+      <w:proofErr w:type="spellStart"/>
+      <w:r>
+        <w:t>CodEquipo</w:t>
+      </w:r>
+      <w:proofErr w:type="spellEnd"/>
+      <w:r>
+        <w:t>.</w:t>
       </w:r>
     </w:p>
     <w:p>
@@ -289,8 +728,13 @@
           <w:numId w:val="16"/>
         </w:numPr>
       </w:pPr>
-      <w:r>
-        <w:t>calcularEstadisticas: Promedio de ataque/defensa de todos los equipos.</w:t>
+      <w:proofErr w:type="spellStart"/>
+      <w:r>
+        <w:t>calcularEstadisticas</w:t>
+      </w:r>
+      <w:proofErr w:type="spellEnd"/>
+      <w:r>
+        <w:t>: Promedio de ataque/defensa de todos los equipos.</w:t>
       </w:r>
     </w:p>
     <w:p>
@@ -332,8 +776,115 @@
         <w:rPr>
           <w:highlight w:val="yellow"/>
         </w:rPr>
-        <w:t xml:space="preserve">: nombreEquipo , codEquipo (2 letras y 7 dígitos) , capitan (obligatorio) , maxHerores y un ArrayList de </w:t>
-      </w:r>
+        <w:t xml:space="preserve">: </w:t>
+      </w:r>
+      <w:proofErr w:type="spellStart"/>
+      <w:proofErr w:type="gramStart"/>
+      <w:r>
+        <w:rPr>
+          <w:highlight w:val="yellow"/>
+        </w:rPr>
+        <w:t>nombreEquipo</w:t>
+      </w:r>
+      <w:proofErr w:type="spellEnd"/>
+      <w:r>
+        <w:rPr>
+          <w:highlight w:val="yellow"/>
+        </w:rPr>
+        <w:t xml:space="preserve"> ,</w:t>
+      </w:r>
+      <w:proofErr w:type="gramEnd"/>
+      <w:r>
+        <w:rPr>
+          <w:highlight w:val="yellow"/>
+        </w:rPr>
+        <w:t xml:space="preserve"> </w:t>
+      </w:r>
+      <w:proofErr w:type="spellStart"/>
+      <w:r>
+        <w:rPr>
+          <w:highlight w:val="yellow"/>
+        </w:rPr>
+        <w:t>codEquipo</w:t>
+      </w:r>
+      <w:proofErr w:type="spellEnd"/>
+      <w:r>
+        <w:rPr>
+          <w:highlight w:val="yellow"/>
+        </w:rPr>
+        <w:t xml:space="preserve"> (2 letras y 7 dígitos</w:t>
+      </w:r>
+      <w:proofErr w:type="gramStart"/>
+      <w:r>
+        <w:rPr>
+          <w:highlight w:val="yellow"/>
+        </w:rPr>
+        <w:t>) ,</w:t>
+      </w:r>
+      <w:proofErr w:type="gramEnd"/>
+      <w:r>
+        <w:rPr>
+          <w:highlight w:val="yellow"/>
+        </w:rPr>
+        <w:t xml:space="preserve"> </w:t>
+      </w:r>
+      <w:proofErr w:type="spellStart"/>
+      <w:r>
+        <w:rPr>
+          <w:highlight w:val="yellow"/>
+        </w:rPr>
+        <w:t>capitan</w:t>
+      </w:r>
+      <w:proofErr w:type="spellEnd"/>
+      <w:r>
+        <w:rPr>
+          <w:highlight w:val="yellow"/>
+        </w:rPr>
+        <w:t xml:space="preserve"> (obligatorio</w:t>
+      </w:r>
+      <w:proofErr w:type="gramStart"/>
+      <w:r>
+        <w:rPr>
+          <w:highlight w:val="yellow"/>
+        </w:rPr>
+        <w:t>) ,</w:t>
+      </w:r>
+      <w:proofErr w:type="gramEnd"/>
+      <w:r>
+        <w:rPr>
+          <w:highlight w:val="yellow"/>
+        </w:rPr>
+        <w:t xml:space="preserve"> </w:t>
+      </w:r>
+      <w:proofErr w:type="spellStart"/>
+      <w:r>
+        <w:rPr>
+          <w:highlight w:val="yellow"/>
+        </w:rPr>
+        <w:t>maxHerores</w:t>
+      </w:r>
+      <w:proofErr w:type="spellEnd"/>
+      <w:r>
+        <w:rPr>
+          <w:highlight w:val="yellow"/>
+        </w:rPr>
+        <w:t xml:space="preserve"> y un </w:t>
+      </w:r>
+      <w:proofErr w:type="spellStart"/>
+      <w:r>
+        <w:rPr>
+          <w:highlight w:val="yellow"/>
+        </w:rPr>
+        <w:t>ArrayList</w:t>
+      </w:r>
+      <w:proofErr w:type="spellEnd"/>
+      <w:r>
+        <w:rPr>
+          <w:highlight w:val="yellow"/>
+        </w:rPr>
+        <w:t xml:space="preserve"> de </w:t>
+      </w:r>
+      <w:proofErr w:type="spellStart"/>
       <w:r>
         <w:rPr>
           <w:b/>
@@ -342,6 +893,7 @@
         </w:rPr>
         <w:t>Heroes</w:t>
       </w:r>
+      <w:proofErr w:type="spellEnd"/>
       <w:r>
         <w:rPr>
           <w:highlight w:val="yellow"/>
@@ -372,7 +924,21 @@
         <w:rPr>
           <w:highlight w:val="yellow"/>
         </w:rPr>
-        <w:t>: eliminarHeroe: Buscar por DNI y dejarlo "sin equipo".</w:t>
+        <w:t xml:space="preserve">: </w:t>
+      </w:r>
+      <w:proofErr w:type="spellStart"/>
+      <w:r>
+        <w:rPr>
+          <w:highlight w:val="yellow"/>
+        </w:rPr>
+        <w:t>eliminarHeroe</w:t>
+      </w:r>
+      <w:proofErr w:type="spellEnd"/>
+      <w:r>
+        <w:rPr>
+          <w:highlight w:val="yellow"/>
+        </w:rPr>
+        <w:t>: Buscar por DNI y dejarlo "sin equipo".</w:t>
       </w:r>
     </w:p>
     <w:p>
@@ -410,7 +976,23 @@
         <w:t>Sincronizar Datos</w:t>
       </w:r>
       <w:r>
-        <w:t>: Leer de .csv y .dat.</w:t>
+        <w:t>: Leer de .</w:t>
+      </w:r>
+      <w:proofErr w:type="spellStart"/>
+      <w:r>
+        <w:t>csv</w:t>
+      </w:r>
+      <w:proofErr w:type="spellEnd"/>
+      <w:r>
+        <w:t xml:space="preserve"> y .</w:t>
+      </w:r>
+      <w:proofErr w:type="spellStart"/>
+      <w:r>
+        <w:t>dat</w:t>
+      </w:r>
+      <w:proofErr w:type="spellEnd"/>
+      <w:r>
+        <w:t>.</w:t>
       </w:r>
     </w:p>
     <w:p>
@@ -524,7 +1106,7 @@
     <w:p>
       <w:r>
         <w:pict w14:anchorId="708798EF">
-          <v:rect id="_x0000_i1040" style="width:0;height:1.5pt" o:hralign="center" o:hrstd="t" o:hr="t" fillcolor="#a0a0a0" stroked="f"/>
+          <v:rect id="_x0000_i1025" style="width:0;height:1.5pt" o:hralign="center" o:hrstd="t" o:hr="t" fillcolor="#a0a0a0" stroked="f"/>
         </w:pict>
       </w:r>
     </w:p>
@@ -565,7 +1147,35 @@
         <w:rPr>
           <w:highlight w:val="yellow"/>
         </w:rPr>
-        <w:t>: Persona -&gt; Heroe -&gt; Capitan. Implementa Serializable en todas.</w:t>
+        <w:t xml:space="preserve">: Persona -&gt; </w:t>
+      </w:r>
+      <w:proofErr w:type="spellStart"/>
+      <w:r>
+        <w:rPr>
+          <w:highlight w:val="yellow"/>
+        </w:rPr>
+        <w:t>Heroe</w:t>
+      </w:r>
+      <w:proofErr w:type="spellEnd"/>
+      <w:r>
+        <w:rPr>
+          <w:highlight w:val="yellow"/>
+        </w:rPr>
+        <w:t xml:space="preserve"> -&gt; Capitan. Implementa </w:t>
+      </w:r>
+      <w:proofErr w:type="spellStart"/>
+      <w:r>
+        <w:rPr>
+          <w:highlight w:val="yellow"/>
+        </w:rPr>
+        <w:t>Serializable</w:t>
+      </w:r>
+      <w:proofErr w:type="spellEnd"/>
+      <w:r>
+        <w:rPr>
+          <w:highlight w:val="yellow"/>
+        </w:rPr>
+        <w:t xml:space="preserve"> en todas.</w:t>
       </w:r>
     </w:p>
     <w:p>
@@ -578,6 +1188,7 @@
           <w:highlight w:val="yellow"/>
         </w:rPr>
       </w:pPr>
+      <w:proofErr w:type="spellStart"/>
       <w:r>
         <w:rPr>
           <w:b/>
@@ -586,12 +1197,29 @@
         </w:rPr>
         <w:t>Enums</w:t>
       </w:r>
-      <w:r>
-        <w:rPr>
-          <w:highlight w:val="yellow"/>
-        </w:rPr>
-        <w:t>: Crea Rango (S, A, B, C) y PoderElemental .</w:t>
-      </w:r>
+      <w:proofErr w:type="spellEnd"/>
+      <w:r>
+        <w:rPr>
+          <w:highlight w:val="yellow"/>
+        </w:rPr>
+        <w:t xml:space="preserve">: Crea Rango (S, A, B, C) y </w:t>
+      </w:r>
+      <w:proofErr w:type="spellStart"/>
+      <w:proofErr w:type="gramStart"/>
+      <w:r>
+        <w:rPr>
+          <w:highlight w:val="yellow"/>
+        </w:rPr>
+        <w:t>PoderElemental</w:t>
+      </w:r>
+      <w:proofErr w:type="spellEnd"/>
+      <w:r>
+        <w:rPr>
+          <w:highlight w:val="yellow"/>
+        </w:rPr>
+        <w:t xml:space="preserve"> .</w:t>
+      </w:r>
+      <w:proofErr w:type="gramEnd"/>
     </w:p>
     <w:p>
       <w:pPr>
@@ -608,7 +1236,23 @@
         <w:t>Excepciones</w:t>
       </w:r>
       <w:r>
-        <w:t>: Crea HeroeYaRegistradoException y CapacidadExcedidaException.</w:t>
+        <w:t xml:space="preserve">: Crea </w:t>
+      </w:r>
+      <w:proofErr w:type="spellStart"/>
+      <w:r>
+        <w:t>HeroeYaRegistradoException</w:t>
+      </w:r>
+      <w:proofErr w:type="spellEnd"/>
+      <w:r>
+        <w:t xml:space="preserve"> y </w:t>
+      </w:r>
+      <w:proofErr w:type="spellStart"/>
+      <w:r>
+        <w:t>CapacidadExcedidaException</w:t>
+      </w:r>
+      <w:proofErr w:type="spellEnd"/>
+      <w:r>
+        <w:t>.</w:t>
       </w:r>
     </w:p>
     <w:p/>
@@ -3938,6 +4582,7 @@
   <w:style w:type="character" w:default="1" w:styleId="Fuentedeprrafopredeter">
     <w:name w:val="Default Paragraph Font"/>
     <w:uiPriority w:val="1"/>
+    <w:semiHidden/>
     <w:unhideWhenUsed/>
   </w:style>
   <w:style w:type="table" w:default="1" w:styleId="Tablanormal">

</xml_diff>

<commit_message>
HERO DAW_Practica de Examen_Finalizada
</commit_message>
<xml_diff>
--- a/HeroDaw-Practica Examen Marzo 2026/documents/EXAMEN DE PROGRAMACIÓN.docx
+++ b/HeroDaw-Practica Examen Marzo 2026/documents/EXAMEN DE PROGRAMACIÓN.docx
@@ -695,29 +695,50 @@
           <w:ilvl w:val="1"/>
           <w:numId w:val="16"/>
         </w:numPr>
+        <w:rPr>
+          <w:highlight w:val="yellow"/>
+        </w:rPr>
       </w:pPr>
       <w:proofErr w:type="spellStart"/>
       <w:r>
+        <w:rPr>
+          <w:highlight w:val="yellow"/>
+        </w:rPr>
         <w:t>asignarHeroeAEquipo</w:t>
       </w:r>
       <w:proofErr w:type="spellEnd"/>
       <w:r>
+        <w:rPr>
+          <w:highlight w:val="yellow"/>
+        </w:rPr>
         <w:t xml:space="preserve">: Comprobar que no exceda el máximo y generar </w:t>
       </w:r>
       <w:proofErr w:type="spellStart"/>
       <w:r>
+        <w:rPr>
+          <w:highlight w:val="yellow"/>
+        </w:rPr>
         <w:t>numContrato</w:t>
       </w:r>
       <w:proofErr w:type="spellEnd"/>
       <w:r>
+        <w:rPr>
+          <w:highlight w:val="yellow"/>
+        </w:rPr>
         <w:t xml:space="preserve"> con formato HERO-</w:t>
       </w:r>
       <w:proofErr w:type="spellStart"/>
       <w:r>
+        <w:rPr>
+          <w:highlight w:val="yellow"/>
+        </w:rPr>
         <w:t>CodEquipo</w:t>
       </w:r>
       <w:proofErr w:type="spellEnd"/>
       <w:r>
+        <w:rPr>
+          <w:highlight w:val="yellow"/>
+        </w:rPr>
         <w:t>.</w:t>
       </w:r>
     </w:p>
@@ -727,13 +748,22 @@
           <w:ilvl w:val="1"/>
           <w:numId w:val="16"/>
         </w:numPr>
+        <w:rPr>
+          <w:highlight w:val="yellow"/>
+        </w:rPr>
       </w:pPr>
       <w:proofErr w:type="spellStart"/>
       <w:r>
+        <w:rPr>
+          <w:highlight w:val="yellow"/>
+        </w:rPr>
         <w:t>calcularEstadisticas</w:t>
       </w:r>
       <w:proofErr w:type="spellEnd"/>
       <w:r>
+        <w:rPr>
+          <w:highlight w:val="yellow"/>
+        </w:rPr>
         <w:t>: Promedio de ataque/defensa de todos los equipos.</w:t>
       </w:r>
     </w:p>
@@ -946,18 +976,28 @@
         <w:rPr>
           <w:b/>
           <w:bCs/>
+          <w:highlight w:val="yellow"/>
         </w:rPr>
       </w:pPr>
       <w:r>
         <w:rPr>
           <w:b/>
           <w:bCs/>
+          <w:highlight w:val="yellow"/>
         </w:rPr>
         <w:t>4. Clase Principal (Main)</w:t>
       </w:r>
     </w:p>
     <w:p>
-      <w:r>
+      <w:pPr>
+        <w:rPr>
+          <w:highlight w:val="yellow"/>
+        </w:rPr>
+      </w:pPr>
+      <w:r>
+        <w:rPr>
+          <w:highlight w:val="yellow"/>
+        </w:rPr>
         <w:t>Menú interactivo repetitivo que maneje excepciones:</w:t>
       </w:r>
     </w:p>
@@ -967,31 +1007,50 @@
           <w:ilvl w:val="0"/>
           <w:numId w:val="18"/>
         </w:numPr>
+        <w:rPr>
+          <w:highlight w:val="yellow"/>
+        </w:rPr>
       </w:pPr>
       <w:r>
         <w:rPr>
           <w:b/>
           <w:bCs/>
+          <w:highlight w:val="yellow"/>
         </w:rPr>
         <w:t>Sincronizar Datos</w:t>
       </w:r>
       <w:r>
+        <w:rPr>
+          <w:highlight w:val="yellow"/>
+        </w:rPr>
         <w:t>: Leer de .</w:t>
       </w:r>
       <w:proofErr w:type="spellStart"/>
       <w:r>
+        <w:rPr>
+          <w:highlight w:val="yellow"/>
+        </w:rPr>
         <w:t>csv</w:t>
       </w:r>
       <w:proofErr w:type="spellEnd"/>
       <w:r>
+        <w:rPr>
+          <w:highlight w:val="yellow"/>
+        </w:rPr>
         <w:t xml:space="preserve"> y .</w:t>
       </w:r>
       <w:proofErr w:type="spellStart"/>
       <w:r>
+        <w:rPr>
+          <w:highlight w:val="yellow"/>
+        </w:rPr>
         <w:t>dat</w:t>
       </w:r>
       <w:proofErr w:type="spellEnd"/>
       <w:r>
+        <w:rPr>
+          <w:highlight w:val="yellow"/>
+        </w:rPr>
         <w:t>.</w:t>
       </w:r>
     </w:p>
@@ -1001,15 +1060,22 @@
           <w:ilvl w:val="0"/>
           <w:numId w:val="18"/>
         </w:numPr>
+        <w:rPr>
+          <w:highlight w:val="yellow"/>
+        </w:rPr>
       </w:pPr>
       <w:r>
         <w:rPr>
           <w:b/>
           <w:bCs/>
+          <w:highlight w:val="yellow"/>
         </w:rPr>
         <w:t>Crear Equipo</w:t>
       </w:r>
       <w:r>
+        <w:rPr>
+          <w:highlight w:val="yellow"/>
+        </w:rPr>
         <w:t>: Pidiendo datos del Capitán primero (debe ser mayor de edad).</w:t>
       </w:r>
     </w:p>
@@ -1019,15 +1085,22 @@
           <w:ilvl w:val="0"/>
           <w:numId w:val="18"/>
         </w:numPr>
+        <w:rPr>
+          <w:highlight w:val="yellow"/>
+        </w:rPr>
       </w:pPr>
       <w:r>
         <w:rPr>
           <w:b/>
           <w:bCs/>
+          <w:highlight w:val="yellow"/>
         </w:rPr>
         <w:t>Registrar Héroe</w:t>
       </w:r>
       <w:r>
+        <w:rPr>
+          <w:highlight w:val="yellow"/>
+        </w:rPr>
         <w:t>: Añadir héroe a un equipo validando que no esté repetido.</w:t>
       </w:r>
     </w:p>
@@ -1037,15 +1110,22 @@
           <w:ilvl w:val="0"/>
           <w:numId w:val="18"/>
         </w:numPr>
+        <w:rPr>
+          <w:highlight w:val="yellow"/>
+        </w:rPr>
       </w:pPr>
       <w:r>
         <w:rPr>
           <w:b/>
           <w:bCs/>
+          <w:highlight w:val="yellow"/>
         </w:rPr>
         <w:t>Mostrar Info Academia</w:t>
       </w:r>
       <w:r>
+        <w:rPr>
+          <w:highlight w:val="yellow"/>
+        </w:rPr>
         <w:t>: Detalle de todos los equipos y sus integrantes.</w:t>
       </w:r>
     </w:p>
@@ -1104,13 +1184,6 @@
       </w:r>
     </w:p>
     <w:p>
-      <w:r>
-        <w:pict w14:anchorId="708798EF">
-          <v:rect id="_x0000_i1025" style="width:0;height:1.5pt" o:hralign="center" o:hrstd="t" o:hr="t" fillcolor="#a0a0a0" stroked="f"/>
-        </w:pict>
-      </w:r>
-    </w:p>
-    <w:p>
       <w:pPr>
         <w:rPr>
           <w:b/>
@@ -1227,31 +1300,50 @@
           <w:ilvl w:val="0"/>
           <w:numId w:val="19"/>
         </w:numPr>
+        <w:rPr>
+          <w:highlight w:val="yellow"/>
+        </w:rPr>
       </w:pPr>
       <w:r>
         <w:rPr>
           <w:b/>
           <w:bCs/>
+          <w:highlight w:val="yellow"/>
         </w:rPr>
         <w:t>Excepciones</w:t>
       </w:r>
       <w:r>
+        <w:rPr>
+          <w:highlight w:val="yellow"/>
+        </w:rPr>
         <w:t xml:space="preserve">: Crea </w:t>
       </w:r>
       <w:proofErr w:type="spellStart"/>
       <w:r>
+        <w:rPr>
+          <w:highlight w:val="yellow"/>
+        </w:rPr>
         <w:t>HeroeYaRegistradoException</w:t>
       </w:r>
       <w:proofErr w:type="spellEnd"/>
       <w:r>
+        <w:rPr>
+          <w:highlight w:val="yellow"/>
+        </w:rPr>
         <w:t xml:space="preserve"> y </w:t>
       </w:r>
       <w:proofErr w:type="spellStart"/>
       <w:r>
+        <w:rPr>
+          <w:highlight w:val="yellow"/>
+        </w:rPr>
         <w:t>CapacidadExcedidaException</w:t>
       </w:r>
       <w:proofErr w:type="spellEnd"/>
       <w:r>
+        <w:rPr>
+          <w:highlight w:val="yellow"/>
+        </w:rPr>
         <w:t>.</w:t>
       </w:r>
     </w:p>

</xml_diff>